<commit_message>
docs(apf2): agregar link del video de la exposición
</commit_message>
<xml_diff>
--- a/docs/APF2_DesarrolloWebIntegrado_Casas_Anderson.docx
+++ b/docs/APF2_DesarrolloWebIntegrado_Casas_Anderson.docx
@@ -258,6 +258,20 @@
           <w:szCs w:val="24"/>
         </w:rPr>
         <w:t xml:space="preserve">Repositorio GitHub: https://github.com/Enrqgonzales/dpao-cookies-web/tree/apf2-frontend</w:t>
+      </w:r>
+    </w:p>
+    <w:p xmlns:a="http://schemas.openxmlformats.org/drawingml/2006/main" xmlns:pic="http://schemas.openxmlformats.org/drawingml/2006/picture">
+      <w:pPr>
+        <w:spacing w:before="0" w:after="0" w:line="360" w:lineRule="auto"/>
+        <w:jc w:val="center"/>
+      </w:pPr>
+      <w:r>
+        <w:rPr>
+          <w:rFonts w:ascii="Times New Roman" w:hAnsi="Times New Roman" w:eastAsia="Times New Roman" w:cs="Times New Roman"/>
+          <w:sz w:val="24"/>
+          <w:szCs w:val="24"/>
+        </w:rPr>
+        <w:t xml:space="preserve">Video de la exposición: https://youtu.be/ACwKXCSWrVQ</w:t>
       </w:r>
     </w:p>
     <w:p>

</xml_diff>